<commit_message>
docs: atualiza modelo da carta de apresentação do edital 2026.2
Co-Authored-By: Claude Opus 5.5 <noreply@anthropic.com>
</commit_message>
<xml_diff>
--- a/public/uploads/editais/2026-2/modeloCarta.docx
+++ b/public/uploads/editais/2026-2/modeloCarta.docx
@@ -541,7 +541,7 @@
                 <w:rFonts w:ascii="Times New Roman" w:cs="Times New Roman" w:eastAsia="Times New Roman" w:hAnsi="Times New Roman"/>
                 <w:rtl w:val="0"/>
               </w:rPr>
-              <w:t xml:space="preserve">Frente de interesse na Liga</w:t>
+              <w:t xml:space="preserve">Frente de interesse</w:t>
             </w:r>
           </w:p>
         </w:tc>
@@ -578,6 +578,77 @@
           </w:p>
         </w:tc>
       </w:tr>
+      <w:tr>
+        <w:trPr>
+          <w:cantSplit w:val="0"/>
+          <w:trHeight w:val="420" w:hRule="atLeast"/>
+          <w:tblHeader w:val="0"/>
+        </w:trPr>
+        <w:tc>
+          <w:tcPr>
+            <w:tcBorders>
+              <w:top w:color="1f4e79" w:space="0" w:sz="6" w:val="single"/>
+              <w:left w:color="1f4e79" w:space="0" w:sz="6" w:val="single"/>
+              <w:bottom w:color="1f4e79" w:space="0" w:sz="6" w:val="single"/>
+              <w:right w:color="1f4e79" w:space="0" w:sz="6" w:val="single"/>
+            </w:tcBorders>
+            <w:tcMar>
+              <w:top w:w="60.0" w:type="dxa"/>
+              <w:left w:w="60.0" w:type="dxa"/>
+              <w:bottom w:w="60.0" w:type="dxa"/>
+              <w:right w:w="60.0" w:type="dxa"/>
+            </w:tcMar>
+            <w:vAlign w:val="top"/>
+          </w:tcPr>
+          <w:p>
+            <w:pPr>
+              <w:spacing w:after="240" w:before="240" w:lineRule="auto"/>
+              <w:rPr>
+                <w:rFonts w:ascii="Times New Roman" w:cs="Times New Roman" w:eastAsia="Times New Roman" w:hAnsi="Times New Roman"/>
+              </w:rPr>
+            </w:pPr>
+            <w:r>
+              <w:rPr>
+                <w:rFonts w:ascii="Times New Roman" w:cs="Times New Roman" w:eastAsia="Times New Roman" w:hAnsi="Times New Roman"/>
+                <w:rtl w:val="0"/>
+              </w:rPr>
+              <w:t xml:space="preserve">Função que gostaria de exercer na Liga</w:t>
+            </w:r>
+          </w:p>
+        </w:tc>
+        <w:tc>
+          <w:tcPr>
+            <w:tcBorders>
+              <w:top w:color="1f4e79" w:space="0" w:sz="6" w:val="single"/>
+              <w:left w:color="1f4e79" w:space="0" w:sz="6" w:val="single"/>
+              <w:bottom w:color="1f4e79" w:space="0" w:sz="6" w:val="single"/>
+              <w:right w:color="1f4e79" w:space="0" w:sz="6" w:val="single"/>
+            </w:tcBorders>
+            <w:tcMar>
+              <w:top w:w="60.0" w:type="dxa"/>
+              <w:left w:w="60.0" w:type="dxa"/>
+              <w:bottom w:w="60.0" w:type="dxa"/>
+              <w:right w:w="60.0" w:type="dxa"/>
+            </w:tcMar>
+            <w:vAlign w:val="top"/>
+          </w:tcPr>
+          <w:p>
+            <w:pPr>
+              <w:spacing w:after="240" w:before="240" w:lineRule="auto"/>
+              <w:rPr>
+                <w:rFonts w:ascii="Times New Roman" w:cs="Times New Roman" w:eastAsia="Times New Roman" w:hAnsi="Times New Roman"/>
+              </w:rPr>
+            </w:pPr>
+            <w:r>
+              <w:rPr>
+                <w:rFonts w:ascii="Times New Roman" w:cs="Times New Roman" w:eastAsia="Times New Roman" w:hAnsi="Times New Roman"/>
+                <w:rtl w:val="0"/>
+              </w:rPr>
+              <w:t xml:space="preserve">(por exemplo: desenvolvimento, design/UX, testes, pesquisa, comunicação ou organização de eventos)</w:t>
+            </w:r>
+          </w:p>
+        </w:tc>
+      </w:tr>
     </w:tbl>
     <w:p>
       <w:pPr>
@@ -616,7 +687,7 @@
           <w:rFonts w:ascii="Times New Roman" w:cs="Times New Roman" w:eastAsia="Times New Roman" w:hAnsi="Times New Roman"/>
           <w:rtl w:val="0"/>
         </w:rPr>
-        <w:t xml:space="preserve">O que você gostaria de aprender, propor ou desenvolver na Liga?</w:t>
+        <w:t xml:space="preserve">Que propostas você gostaria de desenvolver na LAESA? Cite pelo menos uma ideia de atividade, estudo ou projeto e o que gostaria de aprender com ela.</w:t>
       </w:r>
     </w:p>
     <w:p>

</xml_diff>